<commit_message>
Documenta liga productiva de VetAgenda
</commit_message>
<xml_diff>
--- a/docs/VetAgenda_Manual_de_Usuario.docx
+++ b/docs/VetAgenda_Manual_de_Usuario.docx
@@ -389,7 +389,7 @@
           <w:color w:val="1E2E35"/>
           <w:sz w:val="24"/>
         </w:rPr>
-        <w:t>Instala las dependencias y aplica las migraciones conforme al README del repositorio.</w:t>
+        <w:t>Para navegar la versión pública, abre https://vetagenda.onrender.com/.</w:t>
       </w:r>
     </w:p>
     <w:p>
@@ -403,21 +403,7 @@
           <w:color w:val="1E2E35"/>
           <w:sz w:val="24"/>
         </w:rPr>
-        <w:t>Ejecuta python manage.py runserver.</w:t>
-      </w:r>
-    </w:p>
-    <w:p>
-      <w:pPr>
-        <w:pStyle w:val="ListNumber"/>
-        <w:spacing w:line="360" w:lineRule="auto" w:after="100"/>
-      </w:pPr>
-      <w:r>
-        <w:rPr>
-          <w:rFonts w:ascii="Arial" w:hAnsi="Arial"/>
-          <w:color w:val="1E2E35"/>
-          <w:sz w:val="24"/>
-        </w:rPr>
-        <w:t>Abre http://127.0.0.1:8000/ en el navegador.</w:t>
+        <w:t>Si trabajas localmente, instala dependencias, aplica migraciones, ejecuta python manage.py runserver y abre http://127.0.0.1:8000/.</w:t>
       </w:r>
     </w:p>
     <w:p>
@@ -432,6 +418,20 @@
           <w:sz w:val="24"/>
         </w:rPr>
         <w:t>Utiliza la barra superior para desplazarte entre los módulos. Para administración avanzada, entra a /admin/.</w:t>
+      </w:r>
+    </w:p>
+    <w:p>
+      <w:pPr>
+        <w:pStyle w:val="ListNumber"/>
+        <w:spacing w:line="360" w:lineRule="auto" w:after="100"/>
+      </w:pPr>
+      <w:r>
+        <w:rPr>
+          <w:rFonts w:ascii="Arial" w:hAnsi="Arial"/>
+          <w:color w:val="1E2E35"/>
+          <w:sz w:val="24"/>
+        </w:rPr>
+        <w:t>En el plan gratuito, espera unos segundos si la aplicación se está reactivando después de un periodo de inactividad.</w:t>
       </w:r>
     </w:p>
     <w:p>
@@ -1797,7 +1797,7 @@
           <w:color w:val="1E2E35"/>
           <w:sz w:val="24"/>
         </w:rPr>
-        <w:t>La documentación técnica, las migraciones, los datos de demostración, las pruebas y el código fuente están disponibles en https://github.com/anaflrs4/vetagenda-aplicaciones-web-ii.</w:t>
+        <w:t>La aplicación productiva está disponible en https://vetagenda.onrender.com/. La documentación técnica, las migraciones, los datos de demostración, las pruebas y el código fuente están disponibles en https://github.com/anaflrs4/vetagenda-aplicaciones-web-ii.</w:t>
       </w:r>
     </w:p>
     <w:sectPr>

</xml_diff>